<commit_message>
Deployed 3b310e2 with MkDocs version: 1.6.1
</commit_message>
<xml_diff>
--- a/tema4/plantillas/Actividad_4_1_PSP_Plantilla.docx
+++ b/tema4/plantillas/Actividad_4_1_PSP_Plantilla.docx
@@ -1034,7 +1034,7 @@
                 <w:sz w:val="20"/>
                 <w:szCs w:val="20"/>
               </w:rPr>
-              <w:t xml:space="preserve">📸 El segundo ClienteEco sin respuesta, mientras el primero sigue conectado</w:t>
+              <w:t xml:space="preserve">📸 El segundo ClienteEco esperando inicialmente una respuesta y, después de cerrar el primero, recibiendo finalmente su ECO: ...</w:t>
             </w:r>
           </w:p>
         </w:tc>
@@ -1477,7 +1477,7 @@
                 <w:sz w:val="20"/>
                 <w:szCs w:val="20"/>
               </w:rPr>
-              <w:t xml:space="preserve">📸 El cliente que ha enviado SALIR desconectado, mientras el otro sigue funcionando</w:t>
+              <w:t xml:space="preserve">📸 El cliente que ha enviado SALIR mostrando que ya no recibe su respuesta ECO (puede aparecer "Respuesta: null"), mientras el otro cliente sigue funcionando con normalidad</w:t>
             </w:r>
           </w:p>
         </w:tc>

</xml_diff>